<commit_message>
Script de migração do banco e seção de MySQL no guia
- database/migracao_projeto_web.sql: para quem já tem o banco jcondo do
  projeto web e quer preservar os moradores cadastrados
- Guia de execução ganhou a seção 3.4 (XAMPP/MySQL): como preparar o banco
  nas três situações possíveis e os erros comuns de conexão
- Numeração das listas reinicia em cada bloco
</commit_message>
<xml_diff>
--- a/docs/Guia_de_Execucao.docx
+++ b/docs/Guia_de_Execucao.docx
@@ -947,28 +947,6 @@
       </w:tr>
     </w:tbl>
     <w:p>
-      <w:r>
-        <w:br w:type="page"/>
-      </w:r>
-    </w:p>
-    <w:p>
-      <w:pPr>
-        <w:pStyle w:val="Heading1"/>
-        <w:spacing w:after="240" w:before="480" w:line="360"/>
-        <w:jc w:val="left"/>
-      </w:pPr>
-      <w:r>
-        <w:rPr>
-          <w:rFonts w:ascii="Arial" w:cs="Arial" w:eastAsia="Arial" w:hAnsi="Arial"/>
-          <w:b/>
-          <w:bCs/>
-          <w:sz w:val="24"/>
-          <w:szCs w:val="24"/>
-        </w:rPr>
-        <w:t xml:space="preserve">4 PASSO 2: ABRIR O APLICATIVO NO ANDROID STUDIO</w:t>
-      </w:r>
-    </w:p>
-    <w:p>
       <w:pPr>
         <w:pStyle w:val="Heading2"/>
         <w:spacing w:after="200" w:before="360" w:line="360"/>
@@ -982,7 +960,99 @@
           <w:sz w:val="24"/>
           <w:szCs w:val="24"/>
         </w:rPr>
-        <w:t xml:space="preserve">4.1 Abrir o projeto</w:t>
+        <w:t xml:space="preserve">3.4 Alternativa: rodar com o MySQL do XAMPP</w:t>
+      </w:r>
+    </w:p>
+    <w:p>
+      <w:pPr>
+        <w:spacing w:after="120" w:line="360"/>
+        <w:ind w:firstLine="709"/>
+        <w:jc w:val="both"/>
+      </w:pPr>
+      <w:r>
+        <w:rPr>
+          <w:rFonts w:ascii="Arial" w:cs="Arial" w:eastAsia="Arial" w:hAnsi="Arial"/>
+          <w:sz w:val="24"/>
+          <w:szCs w:val="24"/>
+        </w:rPr>
+        <w:t xml:space="preserve">O H2 da seção anterior é só um atalho para demonstrar o trabalho sem instalar banco. A configuração padrão do projeto é MySQL, e é ela que o application.properties já traz preenchida:</w:t>
+      </w:r>
+    </w:p>
+    <w:p>
+      <w:pPr>
+        <w:shd w:fill="F2F2F2" w:val="clear"/>
+        <w:spacing w:after="0" w:before="120" w:line="240"/>
+        <w:ind w:left="283"/>
+      </w:pPr>
+      <w:r>
+        <w:rPr>
+          <w:rFonts w:ascii="Courier New" w:cs="Courier New" w:eastAsia="Courier New" w:hAnsi="Courier New"/>
+          <w:sz w:val="19"/>
+          <w:szCs w:val="19"/>
+        </w:rPr>
+        <w:t xml:space="preserve">spring.datasource.url=jdbc:mysql://localhost:3306/jcondo</w:t>
+      </w:r>
+    </w:p>
+    <w:p>
+      <w:pPr>
+        <w:shd w:fill="F2F2F2" w:val="clear"/>
+        <w:spacing w:after="0" w:before="0" w:line="240"/>
+        <w:ind w:left="283"/>
+      </w:pPr>
+      <w:r>
+        <w:rPr>
+          <w:rFonts w:ascii="Courier New" w:cs="Courier New" w:eastAsia="Courier New" w:hAnsi="Courier New"/>
+          <w:sz w:val="19"/>
+          <w:szCs w:val="19"/>
+        </w:rPr>
+        <w:t xml:space="preserve">spring.datasource.username=root</w:t>
+      </w:r>
+    </w:p>
+    <w:p>
+      <w:pPr>
+        <w:shd w:fill="F2F2F2" w:val="clear"/>
+        <w:spacing w:after="200" w:before="0" w:line="240"/>
+        <w:ind w:left="283"/>
+      </w:pPr>
+      <w:r>
+        <w:rPr>
+          <w:rFonts w:ascii="Courier New" w:cs="Courier New" w:eastAsia="Courier New" w:hAnsi="Courier New"/>
+          <w:sz w:val="19"/>
+          <w:szCs w:val="19"/>
+        </w:rPr>
+        <w:t xml:space="preserve">spring.datasource.password=</w:t>
+      </w:r>
+    </w:p>
+    <w:p>
+      <w:pPr>
+        <w:spacing w:after="120" w:line="360"/>
+        <w:ind w:firstLine="709"/>
+        <w:jc w:val="both"/>
+      </w:pPr>
+      <w:r>
+        <w:rPr>
+          <w:rFonts w:ascii="Arial" w:cs="Arial" w:eastAsia="Arial" w:hAnsi="Arial"/>
+          <w:sz w:val="24"/>
+          <w:szCs w:val="24"/>
+        </w:rPr>
+        <w:t xml:space="preserve">Esses são exatamente os valores do XAMPP recém-instalado: MySQL na porta 3306, usuário root e senha em branco. Se você nunca mexeu na senha do root, não precisa alterar nada nesse arquivo.</w:t>
+      </w:r>
+    </w:p>
+    <w:p>
+      <w:pPr>
+        <w:pStyle w:val="Heading3"/>
+        <w:spacing w:after="180" w:before="300" w:line="360"/>
+        <w:jc w:val="left"/>
+      </w:pPr>
+      <w:r>
+        <w:rPr>
+          <w:rFonts w:ascii="Arial" w:cs="Arial" w:eastAsia="Arial" w:hAnsi="Arial"/>
+          <w:i/>
+          <w:iCs/>
+          <w:sz w:val="24"/>
+          <w:szCs w:val="24"/>
+        </w:rPr>
+        <w:t xml:space="preserve">3.4.1 Ligar o MySQL</w:t>
       </w:r>
     </w:p>
     <w:p>
@@ -990,7 +1060,7 @@
         <w:pStyle w:val="ListParagraph"/>
         <w:numPr>
           <w:ilvl w:val="0"/>
-          <w:numId w:val="2"/>
+          <w:numId w:val="3"/>
         </w:numPr>
         <w:spacing w:after="80" w:line="360"/>
         <w:jc w:val="both"/>
@@ -1001,7 +1071,7 @@
           <w:sz w:val="24"/>
           <w:szCs w:val="24"/>
         </w:rPr>
-        <w:t xml:space="preserve">Abra o Android Studio.</w:t>
+        <w:t xml:space="preserve">Abra o XAMPP Control Panel.</w:t>
       </w:r>
     </w:p>
     <w:p>
@@ -1009,7 +1079,7 @@
         <w:pStyle w:val="ListParagraph"/>
         <w:numPr>
           <w:ilvl w:val="0"/>
-          <w:numId w:val="2"/>
+          <w:numId w:val="3"/>
         </w:numPr>
         <w:spacing w:after="80" w:line="360"/>
         <w:jc w:val="both"/>
@@ -1020,7 +1090,7 @@
           <w:sz w:val="24"/>
           <w:szCs w:val="24"/>
         </w:rPr>
-        <w:t xml:space="preserve">Na tela inicial, clique no botão "Open". Se o Studio abrir direto em outro projeto, vá no menu File e escolha "Open".</w:t>
+        <w:t xml:space="preserve">Na linha do MySQL, clique em Start. O nome fica com fundo verde quando sobe.</w:t>
       </w:r>
     </w:p>
     <w:p>
@@ -1028,7 +1098,7 @@
         <w:pStyle w:val="ListParagraph"/>
         <w:numPr>
           <w:ilvl w:val="0"/>
-          <w:numId w:val="2"/>
+          <w:numId w:val="3"/>
         </w:numPr>
         <w:spacing w:after="80" w:line="360"/>
         <w:jc w:val="both"/>
@@ -1039,7 +1109,302 @@
           <w:sz w:val="24"/>
           <w:szCs w:val="24"/>
         </w:rPr>
-        <w:t xml:space="preserve">Na janela que abrir, navegue até C:\projetos\jcondo-mobile e selecione a pasta mobile. Clique em OK.</w:t>
+        <w:t xml:space="preserve">Clique em Admin na mesma linha, ou acesse http://localhost/phpmyadmin no navegador.</w:t>
+      </w:r>
+    </w:p>
+    <w:p>
+      <w:pPr>
+        <w:pStyle w:val="Heading3"/>
+        <w:spacing w:after="180" w:before="300" w:line="360"/>
+        <w:jc w:val="left"/>
+      </w:pPr>
+      <w:r>
+        <w:rPr>
+          <w:rFonts w:ascii="Arial" w:cs="Arial" w:eastAsia="Arial" w:hAnsi="Arial"/>
+          <w:i/>
+          <w:iCs/>
+          <w:sz w:val="24"/>
+          <w:szCs w:val="24"/>
+        </w:rPr>
+        <w:t xml:space="preserve">3.4.2 Preparar o banco</w:t>
+      </w:r>
+    </w:p>
+    <w:p>
+      <w:pPr>
+        <w:spacing w:after="120" w:line="360"/>
+        <w:ind w:firstLine="709"/>
+        <w:jc w:val="both"/>
+      </w:pPr>
+      <w:r>
+        <w:rPr>
+          <w:rFonts w:ascii="Arial" w:cs="Arial" w:eastAsia="Arial" w:hAnsi="Arial"/>
+          <w:sz w:val="24"/>
+          <w:szCs w:val="24"/>
+        </w:rPr>
+        <w:t xml:space="preserve">Escolha um dos três caminhos, de acordo com a situação do seu MySQL.</w:t>
+      </w:r>
+    </w:p>
+    <w:p>
+      <w:pPr>
+        <w:keepNext/>
+        <w:spacing w:after="80" w:before="240" w:line="240"/>
+        <w:jc w:val="left"/>
+      </w:pPr>
+      <w:r>
+        <w:rPr>
+          <w:rFonts w:ascii="Arial" w:cs="Arial" w:eastAsia="Arial" w:hAnsi="Arial"/>
+          <w:sz w:val="20"/>
+          <w:szCs w:val="20"/>
+        </w:rPr>
+        <w:t xml:space="preserve">Tabela 1 - Como preparar o banco em cada situação</w:t>
+      </w:r>
+    </w:p>
+    <w:tbl>
+      <w:tblPr>
+        <w:tblW w:type="dxa" w:w="9070"/>
+        <w:tblBorders>
+          <w:top w:val="single" w:color="000000" w:sz="4"/>
+          <w:left w:val="single" w:color="000000" w:sz="4"/>
+          <w:bottom w:val="single" w:color="000000" w:sz="4"/>
+          <w:right w:val="single" w:color="000000" w:sz="4"/>
+          <w:insideH w:val="single" w:color="000000" w:sz="4"/>
+          <w:insideV w:val="single" w:color="000000" w:sz="4"/>
+        </w:tblBorders>
+      </w:tblPr>
+      <w:tblGrid>
+        <w:gridCol w:w="3200"/>
+        <w:gridCol w:w="5870"/>
+      </w:tblGrid>
+      <w:tr>
+        <w:trPr>
+          <w:tblHeader/>
+        </w:trPr>
+        <w:tc>
+          <w:tcPr>
+            <w:tcW w:type="dxa" w:w="3200"/>
+            <w:shd w:fill="E8E8E8" w:val="clear"/>
+            <w:tcMar>
+              <w:top w:type="dxa" w:w="70"/>
+              <w:left w:type="dxa" w:w="100"/>
+              <w:bottom w:type="dxa" w:w="70"/>
+              <w:right w:type="dxa" w:w="100"/>
+            </w:tcMar>
+          </w:tcPr>
+          <w:p>
+            <w:pPr>
+              <w:spacing w:after="0" w:line="240"/>
+              <w:jc w:val="left"/>
+            </w:pPr>
+            <w:r>
+              <w:rPr>
+                <w:rFonts w:ascii="Arial" w:cs="Arial" w:eastAsia="Arial" w:hAnsi="Arial"/>
+                <w:b/>
+                <w:bCs/>
+                <w:sz w:val="20"/>
+                <w:szCs w:val="20"/>
+              </w:rPr>
+              <w:t xml:space="preserve">Sua situação</w:t>
+            </w:r>
+          </w:p>
+        </w:tc>
+        <w:tc>
+          <w:tcPr>
+            <w:tcW w:type="dxa" w:w="5870"/>
+            <w:shd w:fill="E8E8E8" w:val="clear"/>
+            <w:tcMar>
+              <w:top w:type="dxa" w:w="70"/>
+              <w:left w:type="dxa" w:w="100"/>
+              <w:bottom w:type="dxa" w:w="70"/>
+              <w:right w:type="dxa" w:w="100"/>
+            </w:tcMar>
+          </w:tcPr>
+          <w:p>
+            <w:pPr>
+              <w:spacing w:after="0" w:line="240"/>
+              <w:jc w:val="left"/>
+            </w:pPr>
+            <w:r>
+              <w:rPr>
+                <w:rFonts w:ascii="Arial" w:cs="Arial" w:eastAsia="Arial" w:hAnsi="Arial"/>
+                <w:b/>
+                <w:bCs/>
+                <w:sz w:val="20"/>
+                <w:szCs w:val="20"/>
+              </w:rPr>
+              <w:t xml:space="preserve">O que fazer</w:t>
+            </w:r>
+          </w:p>
+        </w:tc>
+      </w:tr>
+      <w:tr>
+        <w:tc>
+          <w:tcPr>
+            <w:tcW w:type="dxa" w:w="3200"/>
+            <w:tcMar>
+              <w:top w:type="dxa" w:w="70"/>
+              <w:left w:type="dxa" w:w="100"/>
+              <w:bottom w:type="dxa" w:w="70"/>
+              <w:right w:type="dxa" w:w="100"/>
+            </w:tcMar>
+          </w:tcPr>
+          <w:p>
+            <w:pPr>
+              <w:spacing w:after="0" w:line="240"/>
+              <w:jc w:val="left"/>
+            </w:pPr>
+            <w:r>
+              <w:rPr>
+                <w:rFonts w:ascii="Arial" w:cs="Arial" w:eastAsia="Arial" w:hAnsi="Arial"/>
+                <w:sz w:val="20"/>
+                <w:szCs w:val="20"/>
+              </w:rPr>
+              <w:t xml:space="preserve">Nunca criei o banco jcondo neste computador.</w:t>
+            </w:r>
+          </w:p>
+        </w:tc>
+        <w:tc>
+          <w:tcPr>
+            <w:tcW w:type="dxa" w:w="5870"/>
+            <w:tcMar>
+              <w:top w:type="dxa" w:w="70"/>
+              <w:left w:type="dxa" w:w="100"/>
+              <w:bottom w:type="dxa" w:w="70"/>
+              <w:right w:type="dxa" w:w="100"/>
+            </w:tcMar>
+          </w:tcPr>
+          <w:p>
+            <w:pPr>
+              <w:spacing w:after="0" w:line="240"/>
+              <w:jc w:val="left"/>
+            </w:pPr>
+            <w:r>
+              <w:rPr>
+                <w:rFonts w:ascii="Arial" w:cs="Arial" w:eastAsia="Arial" w:hAnsi="Arial"/>
+                <w:sz w:val="20"/>
+                <w:szCs w:val="20"/>
+              </w:rPr>
+              <w:t xml:space="preserve">No phpMyAdmin, aba "Importar", escolha o arquivo backend/database/jcondo.sql e clique em Executar. Ele cria o banco, as cinco tabelas e os dados de exemplo.</w:t>
+            </w:r>
+          </w:p>
+        </w:tc>
+      </w:tr>
+      <w:tr>
+        <w:tc>
+          <w:tcPr>
+            <w:tcW w:type="dxa" w:w="3200"/>
+            <w:tcMar>
+              <w:top w:type="dxa" w:w="70"/>
+              <w:left w:type="dxa" w:w="100"/>
+              <w:bottom w:type="dxa" w:w="70"/>
+              <w:right w:type="dxa" w:w="100"/>
+            </w:tcMar>
+          </w:tcPr>
+          <w:p>
+            <w:pPr>
+              <w:spacing w:after="0" w:line="240"/>
+              <w:jc w:val="left"/>
+            </w:pPr>
+            <w:r>
+              <w:rPr>
+                <w:rFonts w:ascii="Arial" w:cs="Arial" w:eastAsia="Arial" w:hAnsi="Arial"/>
+                <w:sz w:val="20"/>
+                <w:szCs w:val="20"/>
+              </w:rPr>
+              <w:t xml:space="preserve">Já tenho o banco jcondo, do projeto web, e quero manter os moradores cadastrados.</w:t>
+            </w:r>
+          </w:p>
+        </w:tc>
+        <w:tc>
+          <w:tcPr>
+            <w:tcW w:type="dxa" w:w="5870"/>
+            <w:tcMar>
+              <w:top w:type="dxa" w:w="70"/>
+              <w:left w:type="dxa" w:w="100"/>
+              <w:bottom w:type="dxa" w:w="70"/>
+              <w:right w:type="dxa" w:w="100"/>
+            </w:tcMar>
+          </w:tcPr>
+          <w:p>
+            <w:pPr>
+              <w:spacing w:after="0" w:line="240"/>
+              <w:jc w:val="left"/>
+            </w:pPr>
+            <w:r>
+              <w:rPr>
+                <w:rFonts w:ascii="Arial" w:cs="Arial" w:eastAsia="Arial" w:hAnsi="Arial"/>
+                <w:sz w:val="20"/>
+                <w:szCs w:val="20"/>
+              </w:rPr>
+              <w:t xml:space="preserve">Use backend/database/migracao_projeto_web.sql. Ele explica o que a aplicação faz sozinha e traz o único comando que precisa ser rodado na mão.</w:t>
+            </w:r>
+          </w:p>
+        </w:tc>
+      </w:tr>
+      <w:tr>
+        <w:tc>
+          <w:tcPr>
+            <w:tcW w:type="dxa" w:w="3200"/>
+            <w:tcMar>
+              <w:top w:type="dxa" w:w="70"/>
+              <w:left w:type="dxa" w:w="100"/>
+              <w:bottom w:type="dxa" w:w="70"/>
+              <w:right w:type="dxa" w:w="100"/>
+            </w:tcMar>
+          </w:tcPr>
+          <w:p>
+            <w:pPr>
+              <w:spacing w:after="0" w:line="240"/>
+              <w:jc w:val="left"/>
+            </w:pPr>
+            <w:r>
+              <w:rPr>
+                <w:rFonts w:ascii="Arial" w:cs="Arial" w:eastAsia="Arial" w:hAnsi="Arial"/>
+                <w:sz w:val="20"/>
+                <w:szCs w:val="20"/>
+              </w:rPr>
+              <w:t xml:space="preserve">Já tenho o banco jcondo mas não me importo em perder o conteúdo.</w:t>
+            </w:r>
+          </w:p>
+        </w:tc>
+        <w:tc>
+          <w:tcPr>
+            <w:tcW w:type="dxa" w:w="5870"/>
+            <w:tcMar>
+              <w:top w:type="dxa" w:w="70"/>
+              <w:left w:type="dxa" w:w="100"/>
+              <w:bottom w:type="dxa" w:w="70"/>
+              <w:right w:type="dxa" w:w="100"/>
+            </w:tcMar>
+          </w:tcPr>
+          <w:p>
+            <w:pPr>
+              <w:spacing w:after="0" w:line="240"/>
+              <w:jc w:val="left"/>
+            </w:pPr>
+            <w:r>
+              <w:rPr>
+                <w:rFonts w:ascii="Arial" w:cs="Arial" w:eastAsia="Arial" w:hAnsi="Arial"/>
+                <w:sz w:val="20"/>
+                <w:szCs w:val="20"/>
+              </w:rPr>
+              <w:t xml:space="preserve">No phpMyAdmin, selecione o banco jcondo, vá em "Operações" e clique em "Apagar o banco de dados (DROP)". Depois importe o jcondo.sql normalmente.</w:t>
+            </w:r>
+          </w:p>
+        </w:tc>
+      </w:tr>
+    </w:tbl>
+    <w:p>
+      <w:pPr>
+        <w:spacing w:after="240" w:before="60" w:line="240"/>
+        <w:jc w:val="left"/>
+      </w:pPr>
+      <w:r>
+        <w:rPr>
+          <w:rFonts w:ascii="Arial" w:cs="Arial" w:eastAsia="Arial" w:hAnsi="Arial"/>
+          <w:sz w:val="20"/>
+          <w:szCs w:val="20"/>
+        </w:rPr>
+        <w:t xml:space="preserve">Fonte: o autor (2026).</w:t>
       </w:r>
     </w:p>
     <w:tbl>
@@ -1080,7 +1445,7 @@
                 <w:sz w:val="22"/>
                 <w:szCs w:val="22"/>
               </w:rPr>
-              <w:t xml:space="preserve">Selecione a pasta mobile, e não a jcondo-mobile</w:t>
+              <w:t xml:space="preserve">Você pode nem precisar rodar SQL</w:t>
             </w:r>
           </w:p>
           <w:p>
@@ -1094,7 +1459,7 @@
                 <w:sz w:val="22"/>
                 <w:szCs w:val="22"/>
               </w:rPr>
-              <w:t xml:space="preserve">O projeto Gradle começa dentro de mobile. Se você abrir a pasta de cima, o Android Studio não vai encontrar o arquivo settings.gradle e vai tratar tudo como pasta comum, sem botão de executar. Se isso acontecer, feche o projeto (File &gt; Close Project) e abra de novo apontando para mobile.</w:t>
+              <w:t xml:space="preserve">O projeto está com spring.jpa.hibernate.ddl-auto=update. Isso faz o Hibernate comparar as classes Java com o banco na inicialização e criar o que estiver faltando. Se você criar um banco vazio chamado jcondo no phpMyAdmin e subir a aplicação, as cinco tabelas nascem sozinhas e a classe DataSeeder popula os dados de exemplo. O script SQL existe para documentar o modelo e para quem prefere ver as tabelas antes de rodar.</w:t>
             </w:r>
           </w:p>
         </w:tc>
@@ -1102,38 +1467,19 @@
     </w:tbl>
     <w:p>
       <w:pPr>
-        <w:pStyle w:val="ListParagraph"/>
-        <w:numPr>
-          <w:ilvl w:val="0"/>
-          <w:numId w:val="2"/>
-        </w:numPr>
-        <w:spacing w:after="80" w:line="360"/>
-        <w:jc w:val="both"/>
-      </w:pPr>
-      <w:r>
-        <w:rPr>
-          <w:rFonts w:ascii="Arial" w:cs="Arial" w:eastAsia="Arial" w:hAnsi="Arial"/>
-          <w:sz w:val="24"/>
-          <w:szCs w:val="24"/>
-        </w:rPr>
-        <w:t xml:space="preserve">Se aparecer a caixa "Trust and Open Project?", clique em "Trust Project".</w:t>
-      </w:r>
-    </w:p>
-    <w:p>
-      <w:pPr>
-        <w:pStyle w:val="Heading2"/>
-        <w:spacing w:after="200" w:before="360" w:line="360"/>
+        <w:pStyle w:val="Heading3"/>
+        <w:spacing w:after="180" w:before="300" w:line="360"/>
         <w:jc w:val="left"/>
       </w:pPr>
       <w:r>
         <w:rPr>
           <w:rFonts w:ascii="Arial" w:cs="Arial" w:eastAsia="Arial" w:hAnsi="Arial"/>
-          <w:b/>
-          <w:bCs/>
-          <w:sz w:val="24"/>
-          <w:szCs w:val="24"/>
-        </w:rPr>
-        <w:t xml:space="preserve">4.2 Esperar o Gradle Sync</w:t>
+          <w:i/>
+          <w:iCs/>
+          <w:sz w:val="24"/>
+          <w:szCs w:val="24"/>
+        </w:rPr>
+        <w:t xml:space="preserve">3.4.3 Subir a aplicação com MySQL</w:t>
       </w:r>
     </w:p>
     <w:p>
@@ -1148,7 +1494,22 @@
           <w:sz w:val="24"/>
           <w:szCs w:val="24"/>
         </w:rPr>
-        <w:t xml:space="preserve">Ao abrir, o Studio começa sozinho o Gradle Sync: ele baixa o Gradle 8.9 e as bibliotecas do aplicativo (Retrofit, Material, entre outras). Uma barra de progresso aparece no rodapé da janela, com a mensagem "Gradle: Build Model" ou "Downloading...".</w:t>
+        <w:t xml:space="preserve">É o mesmo comando de antes, só que sem o trecho do perfil h2:</w:t>
+      </w:r>
+    </w:p>
+    <w:p>
+      <w:pPr>
+        <w:shd w:fill="F2F2F2" w:val="clear"/>
+        <w:spacing w:after="200" w:before="120" w:line="240"/>
+        <w:ind w:left="283"/>
+      </w:pPr>
+      <w:r>
+        <w:rPr>
+          <w:rFonts w:ascii="Courier New" w:cs="Courier New" w:eastAsia="Courier New" w:hAnsi="Courier New"/>
+          <w:sz w:val="19"/>
+          <w:szCs w:val="19"/>
+        </w:rPr>
+        <w:t xml:space="preserve">mvnw.cmd spring-boot:run</w:t>
       </w:r>
     </w:p>
     <w:p>
@@ -1163,7 +1524,7 @@
           <w:sz w:val="24"/>
           <w:szCs w:val="24"/>
         </w:rPr>
-        <w:t xml:space="preserve">Na primeira vez isso leva de cinco a quinze minutos, dependendo da internet. Espere terminar. O sinal de que acabou é a mensagem "BUILD SUCCESSFUL" ou "Gradle sync finished" na aba Build, no rodapé.</w:t>
+        <w:t xml:space="preserve">No Linux ou macOS, ./mvnw spring-boot:run.</w:t>
       </w:r>
     </w:p>
     <w:p>
@@ -1178,24 +1539,52 @@
           <w:sz w:val="24"/>
           <w:szCs w:val="24"/>
         </w:rPr>
-        <w:t xml:space="preserve">Se o Studio mostrar uma faixa amarela no topo sugerindo atualizar o Android Gradle Plugin, clique em "Don't remind me again for this project". A atualização não é necessária e pode quebrar a compilação.</w:t>
-      </w:r>
-    </w:p>
-    <w:p>
-      <w:pPr>
-        <w:pStyle w:val="Heading2"/>
-        <w:spacing w:after="200" w:before="360" w:line="360"/>
-        <w:jc w:val="left"/>
-      </w:pPr>
-      <w:r>
-        <w:rPr>
-          <w:rFonts w:ascii="Arial" w:cs="Arial" w:eastAsia="Arial" w:hAnsi="Arial"/>
-          <w:b/>
-          <w:bCs/>
-          <w:sz w:val="24"/>
-          <w:szCs w:val="24"/>
-        </w:rPr>
-        <w:t xml:space="preserve">4.3 Criar o emulador</w:t>
+        <w:t xml:space="preserve">Para conferir que conectou, procure na saída do terminal linhas do HikariPool, que é o pool de conexões:</w:t>
+      </w:r>
+    </w:p>
+    <w:p>
+      <w:pPr>
+        <w:shd w:fill="F2F2F2" w:val="clear"/>
+        <w:spacing w:after="0" w:before="120" w:line="240"/>
+        <w:ind w:left="283"/>
+      </w:pPr>
+      <w:r>
+        <w:rPr>
+          <w:rFonts w:ascii="Courier New" w:cs="Courier New" w:eastAsia="Courier New" w:hAnsi="Courier New"/>
+          <w:sz w:val="19"/>
+          <w:szCs w:val="19"/>
+        </w:rPr>
+        <w:t xml:space="preserve">HikariPool-1 - Starting...</w:t>
+      </w:r>
+    </w:p>
+    <w:p>
+      <w:pPr>
+        <w:shd w:fill="F2F2F2" w:val="clear"/>
+        <w:spacing w:after="0" w:before="0" w:line="240"/>
+        <w:ind w:left="283"/>
+      </w:pPr>
+      <w:r>
+        <w:rPr>
+          <w:rFonts w:ascii="Courier New" w:cs="Courier New" w:eastAsia="Courier New" w:hAnsi="Courier New"/>
+          <w:sz w:val="19"/>
+          <w:szCs w:val="19"/>
+        </w:rPr>
+        <w:t xml:space="preserve">HikariPool-1 - Added connection com.mysql.cj.jdbc.ConnectionImpl@...</w:t>
+      </w:r>
+    </w:p>
+    <w:p>
+      <w:pPr>
+        <w:shd w:fill="F2F2F2" w:val="clear"/>
+        <w:spacing w:after="200" w:before="0" w:line="240"/>
+        <w:ind w:left="283"/>
+      </w:pPr>
+      <w:r>
+        <w:rPr>
+          <w:rFonts w:ascii="Courier New" w:cs="Courier New" w:eastAsia="Courier New" w:hAnsi="Courier New"/>
+          <w:sz w:val="19"/>
+          <w:szCs w:val="19"/>
+        </w:rPr>
+        <w:t xml:space="preserve">HikariPool-1 - Start completed.</w:t>
       </w:r>
     </w:p>
     <w:p>
@@ -1210,102 +1599,490 @@
           <w:sz w:val="24"/>
           <w:szCs w:val="24"/>
         </w:rPr>
-        <w:t xml:space="preserve">Se você já tem um emulador configurado com Android 8.0 ou superior, pule para a seção 4.4.</w:t>
-      </w:r>
-    </w:p>
-    <w:p>
-      <w:pPr>
-        <w:pStyle w:val="ListParagraph"/>
-        <w:numPr>
-          <w:ilvl w:val="0"/>
-          <w:numId w:val="2"/>
-        </w:numPr>
-        <w:spacing w:after="80" w:line="360"/>
-        <w:jc w:val="both"/>
-      </w:pPr>
-      <w:r>
-        <w:rPr>
-          <w:rFonts w:ascii="Arial" w:cs="Arial" w:eastAsia="Arial" w:hAnsi="Arial"/>
-          <w:sz w:val="24"/>
-          <w:szCs w:val="24"/>
-        </w:rPr>
-        <w:t xml:space="preserve">No menu superior, vá em Tools e clique em "Device Manager". Um painel abre na lateral direita.</w:t>
-      </w:r>
-    </w:p>
-    <w:p>
-      <w:pPr>
-        <w:pStyle w:val="ListParagraph"/>
-        <w:numPr>
-          <w:ilvl w:val="0"/>
-          <w:numId w:val="2"/>
-        </w:numPr>
-        <w:spacing w:after="80" w:line="360"/>
-        <w:jc w:val="both"/>
-      </w:pPr>
-      <w:r>
-        <w:rPr>
-          <w:rFonts w:ascii="Arial" w:cs="Arial" w:eastAsia="Arial" w:hAnsi="Arial"/>
-          <w:sz w:val="24"/>
-          <w:szCs w:val="24"/>
-        </w:rPr>
-        <w:t xml:space="preserve">Clique no botão "+" (ou "Create Device", dependendo da versão).</w:t>
-      </w:r>
-    </w:p>
-    <w:p>
-      <w:pPr>
-        <w:pStyle w:val="ListParagraph"/>
-        <w:numPr>
-          <w:ilvl w:val="0"/>
-          <w:numId w:val="2"/>
-        </w:numPr>
-        <w:spacing w:after="80" w:line="360"/>
-        <w:jc w:val="both"/>
-      </w:pPr>
-      <w:r>
-        <w:rPr>
-          <w:rFonts w:ascii="Arial" w:cs="Arial" w:eastAsia="Arial" w:hAnsi="Arial"/>
-          <w:sz w:val="24"/>
-          <w:szCs w:val="24"/>
-        </w:rPr>
-        <w:t xml:space="preserve">Na lista de aparelhos, escolha um Pixel na categoria Phone. O Pixel 7 ou o Pixel 6 servem bem. Clique em Next.</w:t>
-      </w:r>
-    </w:p>
-    <w:p>
-      <w:pPr>
-        <w:pStyle w:val="ListParagraph"/>
-        <w:numPr>
-          <w:ilvl w:val="0"/>
-          <w:numId w:val="2"/>
-        </w:numPr>
-        <w:spacing w:after="80" w:line="360"/>
-        <w:jc w:val="both"/>
-      </w:pPr>
-      <w:r>
-        <w:rPr>
-          <w:rFonts w:ascii="Arial" w:cs="Arial" w:eastAsia="Arial" w:hAnsi="Arial"/>
-          <w:sz w:val="24"/>
-          <w:szCs w:val="24"/>
-        </w:rPr>
-        <w:t xml:space="preserve">Na tela de imagem do sistema, escolha uma linha com API Level 34 ou 35. Se aparecer um ícone de download ao lado do nome, clique nele e espere baixar (cerca de 1,5 GB). Depois clique em Next.</w:t>
-      </w:r>
-    </w:p>
-    <w:p>
-      <w:pPr>
-        <w:pStyle w:val="ListParagraph"/>
-        <w:numPr>
-          <w:ilvl w:val="0"/>
-          <w:numId w:val="2"/>
-        </w:numPr>
-        <w:spacing w:after="80" w:line="360"/>
-        <w:jc w:val="both"/>
-      </w:pPr>
-      <w:r>
-        <w:rPr>
-          <w:rFonts w:ascii="Arial" w:cs="Arial" w:eastAsia="Arial" w:hAnsi="Arial"/>
-          <w:sz w:val="24"/>
-          <w:szCs w:val="24"/>
-        </w:rPr>
-        <w:t xml:space="preserve">Na última tela, deixe o nome padrão e clique em Finish.</w:t>
+        <w:t xml:space="preserve">Se aparecer isso, a conexão com o MySQL está de pé. Volte no phpMyAdmin, atualize a página e confira as cinco tabelas dentro do banco jcondo.</w:t>
+      </w:r>
+    </w:p>
+    <w:p>
+      <w:pPr>
+        <w:pStyle w:val="Heading3"/>
+        <w:spacing w:after="180" w:before="300" w:line="360"/>
+        <w:jc w:val="left"/>
+      </w:pPr>
+      <w:r>
+        <w:rPr>
+          <w:rFonts w:ascii="Arial" w:cs="Arial" w:eastAsia="Arial" w:hAnsi="Arial"/>
+          <w:i/>
+          <w:iCs/>
+          <w:sz w:val="24"/>
+          <w:szCs w:val="24"/>
+        </w:rPr>
+        <w:t xml:space="preserve">3.4.4 Se a senha do root não estiver em branco</w:t>
+      </w:r>
+    </w:p>
+    <w:p>
+      <w:pPr>
+        <w:spacing w:after="120" w:line="360"/>
+        <w:ind w:firstLine="709"/>
+        <w:jc w:val="both"/>
+      </w:pPr>
+      <w:r>
+        <w:rPr>
+          <w:rFonts w:ascii="Arial" w:cs="Arial" w:eastAsia="Arial" w:hAnsi="Arial"/>
+          <w:sz w:val="24"/>
+          <w:szCs w:val="24"/>
+        </w:rPr>
+        <w:t xml:space="preserve">Alguns instaladores pedem uma senha para o root do MySQL. Se for o seu caso, abra backend/src/main/resources/application.properties e preencha a linha correspondente:</w:t>
+      </w:r>
+    </w:p>
+    <w:p>
+      <w:pPr>
+        <w:shd w:fill="F2F2F2" w:val="clear"/>
+        <w:spacing w:after="200" w:before="120" w:line="240"/>
+        <w:ind w:left="283"/>
+      </w:pPr>
+      <w:r>
+        <w:rPr>
+          <w:rFonts w:ascii="Courier New" w:cs="Courier New" w:eastAsia="Courier New" w:hAnsi="Courier New"/>
+          <w:sz w:val="19"/>
+          <w:szCs w:val="19"/>
+        </w:rPr>
+        <w:t xml:space="preserve">spring.datasource.password=sua_senha_aqui</w:t>
+      </w:r>
+    </w:p>
+    <w:p>
+      <w:pPr>
+        <w:pStyle w:val="Heading3"/>
+        <w:spacing w:after="180" w:before="300" w:line="360"/>
+        <w:jc w:val="left"/>
+      </w:pPr>
+      <w:r>
+        <w:rPr>
+          <w:rFonts w:ascii="Arial" w:cs="Arial" w:eastAsia="Arial" w:hAnsi="Arial"/>
+          <w:i/>
+          <w:iCs/>
+          <w:sz w:val="24"/>
+          <w:szCs w:val="24"/>
+        </w:rPr>
+        <w:t xml:space="preserve">3.4.5 Problemas comuns com o MySQL</w:t>
+      </w:r>
+    </w:p>
+    <w:p>
+      <w:pPr>
+        <w:keepNext/>
+        <w:spacing w:after="80" w:before="240" w:line="240"/>
+        <w:jc w:val="left"/>
+      </w:pPr>
+      <w:r>
+        <w:rPr>
+          <w:rFonts w:ascii="Arial" w:cs="Arial" w:eastAsia="Arial" w:hAnsi="Arial"/>
+          <w:sz w:val="20"/>
+          <w:szCs w:val="20"/>
+        </w:rPr>
+        <w:t xml:space="preserve">Tabela 2 - Erros de conexão com o banco</w:t>
+      </w:r>
+    </w:p>
+    <w:tbl>
+      <w:tblPr>
+        <w:tblW w:type="dxa" w:w="9070"/>
+        <w:tblBorders>
+          <w:top w:val="single" w:color="000000" w:sz="4"/>
+          <w:left w:val="single" w:color="000000" w:sz="4"/>
+          <w:bottom w:val="single" w:color="000000" w:sz="4"/>
+          <w:right w:val="single" w:color="000000" w:sz="4"/>
+          <w:insideH w:val="single" w:color="000000" w:sz="4"/>
+          <w:insideV w:val="single" w:color="000000" w:sz="4"/>
+        </w:tblBorders>
+      </w:tblPr>
+      <w:tblGrid>
+        <w:gridCol w:w="3200"/>
+        <w:gridCol w:w="5870"/>
+      </w:tblGrid>
+      <w:tr>
+        <w:trPr>
+          <w:tblHeader/>
+        </w:trPr>
+        <w:tc>
+          <w:tcPr>
+            <w:tcW w:type="dxa" w:w="3200"/>
+            <w:shd w:fill="E8E8E8" w:val="clear"/>
+            <w:tcMar>
+              <w:top w:type="dxa" w:w="70"/>
+              <w:left w:type="dxa" w:w="100"/>
+              <w:bottom w:type="dxa" w:w="70"/>
+              <w:right w:type="dxa" w:w="100"/>
+            </w:tcMar>
+          </w:tcPr>
+          <w:p>
+            <w:pPr>
+              <w:spacing w:after="0" w:line="240"/>
+              <w:jc w:val="left"/>
+            </w:pPr>
+            <w:r>
+              <w:rPr>
+                <w:rFonts w:ascii="Arial" w:cs="Arial" w:eastAsia="Arial" w:hAnsi="Arial"/>
+                <w:b/>
+                <w:bCs/>
+                <w:sz w:val="20"/>
+                <w:szCs w:val="20"/>
+              </w:rPr>
+              <w:t xml:space="preserve">O que aparece no terminal</w:t>
+            </w:r>
+          </w:p>
+        </w:tc>
+        <w:tc>
+          <w:tcPr>
+            <w:tcW w:type="dxa" w:w="5870"/>
+            <w:shd w:fill="E8E8E8" w:val="clear"/>
+            <w:tcMar>
+              <w:top w:type="dxa" w:w="70"/>
+              <w:left w:type="dxa" w:w="100"/>
+              <w:bottom w:type="dxa" w:w="70"/>
+              <w:right w:type="dxa" w:w="100"/>
+            </w:tcMar>
+          </w:tcPr>
+          <w:p>
+            <w:pPr>
+              <w:spacing w:after="0" w:line="240"/>
+              <w:jc w:val="left"/>
+            </w:pPr>
+            <w:r>
+              <w:rPr>
+                <w:rFonts w:ascii="Arial" w:cs="Arial" w:eastAsia="Arial" w:hAnsi="Arial"/>
+                <w:b/>
+                <w:bCs/>
+                <w:sz w:val="20"/>
+                <w:szCs w:val="20"/>
+              </w:rPr>
+              <w:t xml:space="preserve">Causa e solução</w:t>
+            </w:r>
+          </w:p>
+        </w:tc>
+      </w:tr>
+      <w:tr>
+        <w:tc>
+          <w:tcPr>
+            <w:tcW w:type="dxa" w:w="3200"/>
+            <w:tcMar>
+              <w:top w:type="dxa" w:w="70"/>
+              <w:left w:type="dxa" w:w="100"/>
+              <w:bottom w:type="dxa" w:w="70"/>
+              <w:right w:type="dxa" w:w="100"/>
+            </w:tcMar>
+          </w:tcPr>
+          <w:p>
+            <w:pPr>
+              <w:spacing w:after="0" w:line="240"/>
+              <w:jc w:val="left"/>
+            </w:pPr>
+            <w:r>
+              <w:rPr>
+                <w:rFonts w:ascii="Arial" w:cs="Arial" w:eastAsia="Arial" w:hAnsi="Arial"/>
+                <w:sz w:val="20"/>
+                <w:szCs w:val="20"/>
+              </w:rPr>
+              <w:t xml:space="preserve">Communications link failure</w:t>
+            </w:r>
+          </w:p>
+        </w:tc>
+        <w:tc>
+          <w:tcPr>
+            <w:tcW w:type="dxa" w:w="5870"/>
+            <w:tcMar>
+              <w:top w:type="dxa" w:w="70"/>
+              <w:left w:type="dxa" w:w="100"/>
+              <w:bottom w:type="dxa" w:w="70"/>
+              <w:right w:type="dxa" w:w="100"/>
+            </w:tcMar>
+          </w:tcPr>
+          <w:p>
+            <w:pPr>
+              <w:spacing w:after="0" w:line="240"/>
+              <w:jc w:val="left"/>
+            </w:pPr>
+            <w:r>
+              <w:rPr>
+                <w:rFonts w:ascii="Arial" w:cs="Arial" w:eastAsia="Arial" w:hAnsi="Arial"/>
+                <w:sz w:val="20"/>
+                <w:szCs w:val="20"/>
+              </w:rPr>
+              <w:t xml:space="preserve">O MySQL não está rodando. Volte no XAMPP Control Panel e clique em Start na linha do MySQL.</w:t>
+            </w:r>
+          </w:p>
+        </w:tc>
+      </w:tr>
+      <w:tr>
+        <w:tc>
+          <w:tcPr>
+            <w:tcW w:type="dxa" w:w="3200"/>
+            <w:tcMar>
+              <w:top w:type="dxa" w:w="70"/>
+              <w:left w:type="dxa" w:w="100"/>
+              <w:bottom w:type="dxa" w:w="70"/>
+              <w:right w:type="dxa" w:w="100"/>
+            </w:tcMar>
+          </w:tcPr>
+          <w:p>
+            <w:pPr>
+              <w:spacing w:after="0" w:line="240"/>
+              <w:jc w:val="left"/>
+            </w:pPr>
+            <w:r>
+              <w:rPr>
+                <w:rFonts w:ascii="Arial" w:cs="Arial" w:eastAsia="Arial" w:hAnsi="Arial"/>
+                <w:sz w:val="20"/>
+                <w:szCs w:val="20"/>
+              </w:rPr>
+              <w:t xml:space="preserve">Unknown database 'jcondo'</w:t>
+            </w:r>
+          </w:p>
+        </w:tc>
+        <w:tc>
+          <w:tcPr>
+            <w:tcW w:type="dxa" w:w="5870"/>
+            <w:tcMar>
+              <w:top w:type="dxa" w:w="70"/>
+              <w:left w:type="dxa" w:w="100"/>
+              <w:bottom w:type="dxa" w:w="70"/>
+              <w:right w:type="dxa" w:w="100"/>
+            </w:tcMar>
+          </w:tcPr>
+          <w:p>
+            <w:pPr>
+              <w:spacing w:after="0" w:line="240"/>
+              <w:jc w:val="left"/>
+            </w:pPr>
+            <w:r>
+              <w:rPr>
+                <w:rFonts w:ascii="Arial" w:cs="Arial" w:eastAsia="Arial" w:hAnsi="Arial"/>
+                <w:sz w:val="20"/>
+                <w:szCs w:val="20"/>
+              </w:rPr>
+              <w:t xml:space="preserve">O banco não existe. Crie pelo phpMyAdmin ou importe o jcondo.sql.</w:t>
+            </w:r>
+          </w:p>
+        </w:tc>
+      </w:tr>
+      <w:tr>
+        <w:tc>
+          <w:tcPr>
+            <w:tcW w:type="dxa" w:w="3200"/>
+            <w:tcMar>
+              <w:top w:type="dxa" w:w="70"/>
+              <w:left w:type="dxa" w:w="100"/>
+              <w:bottom w:type="dxa" w:w="70"/>
+              <w:right w:type="dxa" w:w="100"/>
+            </w:tcMar>
+          </w:tcPr>
+          <w:p>
+            <w:pPr>
+              <w:spacing w:after="0" w:line="240"/>
+              <w:jc w:val="left"/>
+            </w:pPr>
+            <w:r>
+              <w:rPr>
+                <w:rFonts w:ascii="Arial" w:cs="Arial" w:eastAsia="Arial" w:hAnsi="Arial"/>
+                <w:sz w:val="20"/>
+                <w:szCs w:val="20"/>
+              </w:rPr>
+              <w:t xml:space="preserve">Access denied for user 'root'@'localhost'</w:t>
+            </w:r>
+          </w:p>
+        </w:tc>
+        <w:tc>
+          <w:tcPr>
+            <w:tcW w:type="dxa" w:w="5870"/>
+            <w:tcMar>
+              <w:top w:type="dxa" w:w="70"/>
+              <w:left w:type="dxa" w:w="100"/>
+              <w:bottom w:type="dxa" w:w="70"/>
+              <w:right w:type="dxa" w:w="100"/>
+            </w:tcMar>
+          </w:tcPr>
+          <w:p>
+            <w:pPr>
+              <w:spacing w:after="0" w:line="240"/>
+              <w:jc w:val="left"/>
+            </w:pPr>
+            <w:r>
+              <w:rPr>
+                <w:rFonts w:ascii="Arial" w:cs="Arial" w:eastAsia="Arial" w:hAnsi="Arial"/>
+                <w:sz w:val="20"/>
+                <w:szCs w:val="20"/>
+              </w:rPr>
+              <w:t xml:space="preserve">A senha do root não está em branco. Preencha spring.datasource.password no application.properties.</w:t>
+            </w:r>
+          </w:p>
+        </w:tc>
+      </w:tr>
+      <w:tr>
+        <w:tc>
+          <w:tcPr>
+            <w:tcW w:type="dxa" w:w="3200"/>
+            <w:tcMar>
+              <w:top w:type="dxa" w:w="70"/>
+              <w:left w:type="dxa" w:w="100"/>
+              <w:bottom w:type="dxa" w:w="70"/>
+              <w:right w:type="dxa" w:w="100"/>
+            </w:tcMar>
+          </w:tcPr>
+          <w:p>
+            <w:pPr>
+              <w:spacing w:after="0" w:line="240"/>
+              <w:jc w:val="left"/>
+            </w:pPr>
+            <w:r>
+              <w:rPr>
+                <w:rFonts w:ascii="Arial" w:cs="Arial" w:eastAsia="Arial" w:hAnsi="Arial"/>
+                <w:sz w:val="20"/>
+                <w:szCs w:val="20"/>
+              </w:rPr>
+              <w:t xml:space="preserve">Port 3306 já em uso, ou o MySQL não sobe no XAMPP</w:t>
+            </w:r>
+          </w:p>
+        </w:tc>
+        <w:tc>
+          <w:tcPr>
+            <w:tcW w:type="dxa" w:w="5870"/>
+            <w:tcMar>
+              <w:top w:type="dxa" w:w="70"/>
+              <w:left w:type="dxa" w:w="100"/>
+              <w:bottom w:type="dxa" w:w="70"/>
+              <w:right w:type="dxa" w:w="100"/>
+            </w:tcMar>
+          </w:tcPr>
+          <w:p>
+            <w:pPr>
+              <w:spacing w:after="0" w:line="240"/>
+              <w:jc w:val="left"/>
+            </w:pPr>
+            <w:r>
+              <w:rPr>
+                <w:rFonts w:ascii="Arial" w:cs="Arial" w:eastAsia="Arial" w:hAnsi="Arial"/>
+                <w:sz w:val="20"/>
+                <w:szCs w:val="20"/>
+              </w:rPr>
+              <w:t xml:space="preserve">Costuma ser outro MySQL instalado como serviço do Windows. Abra Serviços, pare o serviço MySQL e tente de novo pelo XAMPP.</w:t>
+            </w:r>
+          </w:p>
+        </w:tc>
+      </w:tr>
+      <w:tr>
+        <w:tc>
+          <w:tcPr>
+            <w:tcW w:type="dxa" w:w="3200"/>
+            <w:tcMar>
+              <w:top w:type="dxa" w:w="70"/>
+              <w:left w:type="dxa" w:w="100"/>
+              <w:bottom w:type="dxa" w:w="70"/>
+              <w:right w:type="dxa" w:w="100"/>
+            </w:tcMar>
+          </w:tcPr>
+          <w:p>
+            <w:pPr>
+              <w:spacing w:after="0" w:line="240"/>
+              <w:jc w:val="left"/>
+            </w:pPr>
+            <w:r>
+              <w:rPr>
+                <w:rFonts w:ascii="Arial" w:cs="Arial" w:eastAsia="Arial" w:hAnsi="Arial"/>
+                <w:sz w:val="20"/>
+                <w:szCs w:val="20"/>
+              </w:rPr>
+              <w:t xml:space="preserve">Table 'jcondo.avisos' doesn't exist</w:t>
+            </w:r>
+          </w:p>
+        </w:tc>
+        <w:tc>
+          <w:tcPr>
+            <w:tcW w:type="dxa" w:w="5870"/>
+            <w:tcMar>
+              <w:top w:type="dxa" w:w="70"/>
+              <w:left w:type="dxa" w:w="100"/>
+              <w:bottom w:type="dxa" w:w="70"/>
+              <w:right w:type="dxa" w:w="100"/>
+            </w:tcMar>
+          </w:tcPr>
+          <w:p>
+            <w:pPr>
+              <w:spacing w:after="0" w:line="240"/>
+              <w:jc w:val="left"/>
+            </w:pPr>
+            <w:r>
+              <w:rPr>
+                <w:rFonts w:ascii="Arial" w:cs="Arial" w:eastAsia="Arial" w:hAnsi="Arial"/>
+                <w:sz w:val="20"/>
+                <w:szCs w:val="20"/>
+              </w:rPr>
+              <w:t xml:space="preserve">As tabelas novas não foram criadas. Confira se ddl-auto=update continua no application.properties, ou rode os CREATE TABLE do arquivo de migração.</w:t>
+            </w:r>
+          </w:p>
+        </w:tc>
+      </w:tr>
+      <w:tr>
+        <w:tc>
+          <w:tcPr>
+            <w:tcW w:type="dxa" w:w="3200"/>
+            <w:tcMar>
+              <w:top w:type="dxa" w:w="70"/>
+              <w:left w:type="dxa" w:w="100"/>
+              <w:bottom w:type="dxa" w:w="70"/>
+              <w:right w:type="dxa" w:w="100"/>
+            </w:tcMar>
+          </w:tcPr>
+          <w:p>
+            <w:pPr>
+              <w:spacing w:after="0" w:line="240"/>
+              <w:jc w:val="left"/>
+            </w:pPr>
+            <w:r>
+              <w:rPr>
+                <w:rFonts w:ascii="Arial" w:cs="Arial" w:eastAsia="Arial" w:hAnsi="Arial"/>
+                <w:sz w:val="20"/>
+                <w:szCs w:val="20"/>
+              </w:rPr>
+              <w:t xml:space="preserve">Acentos aparecem trocados no phpMyAdmin</w:t>
+            </w:r>
+          </w:p>
+        </w:tc>
+        <w:tc>
+          <w:tcPr>
+            <w:tcW w:type="dxa" w:w="5870"/>
+            <w:tcMar>
+              <w:top w:type="dxa" w:w="70"/>
+              <w:left w:type="dxa" w:w="100"/>
+              <w:bottom w:type="dxa" w:w="70"/>
+              <w:right w:type="dxa" w:w="100"/>
+            </w:tcMar>
+          </w:tcPr>
+          <w:p>
+            <w:pPr>
+              <w:spacing w:after="0" w:line="240"/>
+              <w:jc w:val="left"/>
+            </w:pPr>
+            <w:r>
+              <w:rPr>
+                <w:rFonts w:ascii="Arial" w:cs="Arial" w:eastAsia="Arial" w:hAnsi="Arial"/>
+                <w:sz w:val="20"/>
+                <w:szCs w:val="20"/>
+              </w:rPr>
+              <w:t xml:space="preserve">O banco não está em utf8mb4. O jcondo.sql já cria com esse conjunto de caracteres; se você criou o banco na mão, escolha utf8mb4_unicode_ci na hora de criar.</w:t>
+            </w:r>
+          </w:p>
+        </w:tc>
+      </w:tr>
+    </w:tbl>
+    <w:p>
+      <w:pPr>
+        <w:spacing w:after="240" w:before="60" w:line="240"/>
+        <w:jc w:val="left"/>
+      </w:pPr>
+      <w:r>
+        <w:rPr>
+          <w:rFonts w:ascii="Arial" w:cs="Arial" w:eastAsia="Arial" w:hAnsi="Arial"/>
+          <w:sz w:val="20"/>
+          <w:szCs w:val="20"/>
+        </w:rPr>
+        <w:t xml:space="preserve">Fonte: o autor (2026).</w:t>
       </w:r>
     </w:p>
     <w:tbl>
@@ -1346,7 +2123,7 @@
                 <w:sz w:val="22"/>
                 <w:szCs w:val="22"/>
               </w:rPr>
-              <w:t xml:space="preserve">Qual API escolher</w:t>
+              <w:t xml:space="preserve">Qual usar no dia da apresentação</w:t>
             </w:r>
           </w:p>
           <w:p>
@@ -1360,12 +2137,34 @@
                 <w:sz w:val="22"/>
                 <w:szCs w:val="22"/>
               </w:rPr>
-              <w:t xml:space="preserve">O aplicativo roda de API 26 até API 35. Recomendo API 33 ou superior porque é nelas que a permissão de notificação é pedida em tempo de execução, e isso faz parte do que o trabalho demonstra. Em API menor que 33 a notificação funciona, mas sem a tela de permissão.</w:t>
+              <w:t xml:space="preserve">Os dois funcionam igual do ponto de vista do aplicativo: o app não sabe qual banco está atrás da API. O H2 tem a vantagem de recarregar os dados de exemplo a cada inicialização, então se você bagunçar alguma coisa testando, basta reiniciar. O MySQL tem a vantagem de mostrar as tabelas no phpMyAdmin, o que é bom se o professor pedir para ver o banco. Se for demonstrar o modelo de dados, use MySQL; se for só rodar o aplicativo, o H2 dá menos trabalho.</w:t>
             </w:r>
           </w:p>
         </w:tc>
       </w:tr>
     </w:tbl>
+    <w:p>
+      <w:r>
+        <w:br w:type="page"/>
+      </w:r>
+    </w:p>
+    <w:p>
+      <w:pPr>
+        <w:pStyle w:val="Heading1"/>
+        <w:spacing w:after="240" w:before="480" w:line="360"/>
+        <w:jc w:val="left"/>
+      </w:pPr>
+      <w:r>
+        <w:rPr>
+          <w:rFonts w:ascii="Arial" w:cs="Arial" w:eastAsia="Arial" w:hAnsi="Arial"/>
+          <w:b/>
+          <w:bCs/>
+          <w:sz w:val="24"/>
+          <w:szCs w:val="24"/>
+        </w:rPr>
+        <w:t xml:space="preserve">4 PASSO 2: ABRIR O APLICATIVO NO ANDROID STUDIO</w:t>
+      </w:r>
+    </w:p>
     <w:p>
       <w:pPr>
         <w:pStyle w:val="Heading2"/>
@@ -1380,7 +2179,7 @@
           <w:sz w:val="24"/>
           <w:szCs w:val="24"/>
         </w:rPr>
-        <w:t xml:space="preserve">4.4 Executar</w:t>
+        <w:t xml:space="preserve">4.1 Abrir o projeto</w:t>
       </w:r>
     </w:p>
     <w:p>
@@ -1388,7 +2187,7 @@
         <w:pStyle w:val="ListParagraph"/>
         <w:numPr>
           <w:ilvl w:val="0"/>
-          <w:numId w:val="2"/>
+          <w:numId w:val="4"/>
         </w:numPr>
         <w:spacing w:after="80" w:line="360"/>
         <w:jc w:val="both"/>
@@ -1399,7 +2198,7 @@
           <w:sz w:val="24"/>
           <w:szCs w:val="24"/>
         </w:rPr>
-        <w:t xml:space="preserve">Na barra superior do Android Studio, ao lado do botão verde de play, há uma caixa de seleção de dispositivo. Clique nela e escolha o emulador que você criou.</w:t>
+        <w:t xml:space="preserve">Abra o Android Studio.</w:t>
       </w:r>
     </w:p>
     <w:p>
@@ -1407,7 +2206,7 @@
         <w:pStyle w:val="ListParagraph"/>
         <w:numPr>
           <w:ilvl w:val="0"/>
-          <w:numId w:val="2"/>
+          <w:numId w:val="4"/>
         </w:numPr>
         <w:spacing w:after="80" w:line="360"/>
         <w:jc w:val="both"/>
@@ -1418,7 +2217,7 @@
           <w:sz w:val="24"/>
           <w:szCs w:val="24"/>
         </w:rPr>
-        <w:t xml:space="preserve">Confirme que ao lado, na outra caixa, está selecionado "app".</w:t>
+        <w:t xml:space="preserve">Na tela inicial, clique no botão "Open". Se o Studio abrir direto em outro projeto, vá no menu File e escolha "Open".</w:t>
       </w:r>
     </w:p>
     <w:p>
@@ -1426,7 +2225,405 @@
         <w:pStyle w:val="ListParagraph"/>
         <w:numPr>
           <w:ilvl w:val="0"/>
-          <w:numId w:val="2"/>
+          <w:numId w:val="4"/>
+        </w:numPr>
+        <w:spacing w:after="80" w:line="360"/>
+        <w:jc w:val="both"/>
+      </w:pPr>
+      <w:r>
+        <w:rPr>
+          <w:rFonts w:ascii="Arial" w:cs="Arial" w:eastAsia="Arial" w:hAnsi="Arial"/>
+          <w:sz w:val="24"/>
+          <w:szCs w:val="24"/>
+        </w:rPr>
+        <w:t xml:space="preserve">Na janela que abrir, navegue até C:\projetos\jcondo-mobile e selecione a pasta mobile. Clique em OK.</w:t>
+      </w:r>
+    </w:p>
+    <w:tbl>
+      <w:tblPr>
+        <w:tblW w:type="dxa" w:w="9070"/>
+        <w:tblBorders>
+          <w:top w:val="single" w:color="000000" w:sz="4"/>
+          <w:left w:val="single" w:color="000000" w:sz="4"/>
+          <w:bottom w:val="single" w:color="000000" w:sz="4"/>
+          <w:right w:val="single" w:color="000000" w:sz="4"/>
+          <w:insideH w:val="single" w:color="000000" w:sz="4"/>
+          <w:insideV w:val="single" w:color="000000" w:sz="4"/>
+        </w:tblBorders>
+      </w:tblPr>
+      <w:tblGrid>
+        <w:gridCol w:w="9070"/>
+      </w:tblGrid>
+      <w:tr>
+        <w:tc>
+          <w:tcPr>
+            <w:tcW w:type="dxa" w:w="9070"/>
+            <w:tcMar>
+              <w:top w:type="dxa" w:w="120"/>
+              <w:left w:type="dxa" w:w="150"/>
+              <w:bottom w:type="dxa" w:w="120"/>
+              <w:right w:type="dxa" w:w="150"/>
+            </w:tcMar>
+          </w:tcPr>
+          <w:p>
+            <w:pPr>
+              <w:spacing w:after="60" w:line="240"/>
+            </w:pPr>
+            <w:r>
+              <w:rPr>
+                <w:rFonts w:ascii="Arial" w:cs="Arial" w:eastAsia="Arial" w:hAnsi="Arial"/>
+                <w:b/>
+                <w:bCs/>
+                <w:sz w:val="22"/>
+                <w:szCs w:val="22"/>
+              </w:rPr>
+              <w:t xml:space="preserve">Selecione a pasta mobile, e não a jcondo-mobile</w:t>
+            </w:r>
+          </w:p>
+          <w:p>
+            <w:pPr>
+              <w:spacing w:after="0" w:line="240"/>
+              <w:jc w:val="both"/>
+            </w:pPr>
+            <w:r>
+              <w:rPr>
+                <w:rFonts w:ascii="Arial" w:cs="Arial" w:eastAsia="Arial" w:hAnsi="Arial"/>
+                <w:sz w:val="22"/>
+                <w:szCs w:val="22"/>
+              </w:rPr>
+              <w:t xml:space="preserve">O projeto Gradle começa dentro de mobile. Se você abrir a pasta de cima, o Android Studio não vai encontrar o arquivo settings.gradle e vai tratar tudo como pasta comum, sem botão de executar. Se isso acontecer, feche o projeto (File &gt; Close Project) e abra de novo apontando para mobile.</w:t>
+            </w:r>
+          </w:p>
+        </w:tc>
+      </w:tr>
+    </w:tbl>
+    <w:p>
+      <w:pPr>
+        <w:pStyle w:val="ListParagraph"/>
+        <w:numPr>
+          <w:ilvl w:val="0"/>
+          <w:numId w:val="4"/>
+        </w:numPr>
+        <w:spacing w:after="80" w:line="360"/>
+        <w:jc w:val="both"/>
+      </w:pPr>
+      <w:r>
+        <w:rPr>
+          <w:rFonts w:ascii="Arial" w:cs="Arial" w:eastAsia="Arial" w:hAnsi="Arial"/>
+          <w:sz w:val="24"/>
+          <w:szCs w:val="24"/>
+        </w:rPr>
+        <w:t xml:space="preserve">Se aparecer a caixa "Trust and Open Project?", clique em "Trust Project".</w:t>
+      </w:r>
+    </w:p>
+    <w:p>
+      <w:pPr>
+        <w:pStyle w:val="Heading2"/>
+        <w:spacing w:after="200" w:before="360" w:line="360"/>
+        <w:jc w:val="left"/>
+      </w:pPr>
+      <w:r>
+        <w:rPr>
+          <w:rFonts w:ascii="Arial" w:cs="Arial" w:eastAsia="Arial" w:hAnsi="Arial"/>
+          <w:b/>
+          <w:bCs/>
+          <w:sz w:val="24"/>
+          <w:szCs w:val="24"/>
+        </w:rPr>
+        <w:t xml:space="preserve">4.2 Esperar o Gradle Sync</w:t>
+      </w:r>
+    </w:p>
+    <w:p>
+      <w:pPr>
+        <w:spacing w:after="120" w:line="360"/>
+        <w:ind w:firstLine="709"/>
+        <w:jc w:val="both"/>
+      </w:pPr>
+      <w:r>
+        <w:rPr>
+          <w:rFonts w:ascii="Arial" w:cs="Arial" w:eastAsia="Arial" w:hAnsi="Arial"/>
+          <w:sz w:val="24"/>
+          <w:szCs w:val="24"/>
+        </w:rPr>
+        <w:t xml:space="preserve">Ao abrir, o Studio começa sozinho o Gradle Sync: ele baixa o Gradle 8.9 e as bibliotecas do aplicativo (Retrofit, Material, entre outras). Uma barra de progresso aparece no rodapé da janela, com a mensagem "Gradle: Build Model" ou "Downloading...".</w:t>
+      </w:r>
+    </w:p>
+    <w:p>
+      <w:pPr>
+        <w:spacing w:after="120" w:line="360"/>
+        <w:ind w:firstLine="709"/>
+        <w:jc w:val="both"/>
+      </w:pPr>
+      <w:r>
+        <w:rPr>
+          <w:rFonts w:ascii="Arial" w:cs="Arial" w:eastAsia="Arial" w:hAnsi="Arial"/>
+          <w:sz w:val="24"/>
+          <w:szCs w:val="24"/>
+        </w:rPr>
+        <w:t xml:space="preserve">Na primeira vez isso leva de cinco a quinze minutos, dependendo da internet. Espere terminar. O sinal de que acabou é a mensagem "BUILD SUCCESSFUL" ou "Gradle sync finished" na aba Build, no rodapé.</w:t>
+      </w:r>
+    </w:p>
+    <w:p>
+      <w:pPr>
+        <w:spacing w:after="120" w:line="360"/>
+        <w:ind w:firstLine="709"/>
+        <w:jc w:val="both"/>
+      </w:pPr>
+      <w:r>
+        <w:rPr>
+          <w:rFonts w:ascii="Arial" w:cs="Arial" w:eastAsia="Arial" w:hAnsi="Arial"/>
+          <w:sz w:val="24"/>
+          <w:szCs w:val="24"/>
+        </w:rPr>
+        <w:t xml:space="preserve">Se o Studio mostrar uma faixa amarela no topo sugerindo atualizar o Android Gradle Plugin, clique em "Don't remind me again for this project". A atualização não é necessária e pode quebrar a compilação.</w:t>
+      </w:r>
+    </w:p>
+    <w:p>
+      <w:pPr>
+        <w:pStyle w:val="Heading2"/>
+        <w:spacing w:after="200" w:before="360" w:line="360"/>
+        <w:jc w:val="left"/>
+      </w:pPr>
+      <w:r>
+        <w:rPr>
+          <w:rFonts w:ascii="Arial" w:cs="Arial" w:eastAsia="Arial" w:hAnsi="Arial"/>
+          <w:b/>
+          <w:bCs/>
+          <w:sz w:val="24"/>
+          <w:szCs w:val="24"/>
+        </w:rPr>
+        <w:t xml:space="preserve">4.3 Criar o emulador</w:t>
+      </w:r>
+    </w:p>
+    <w:p>
+      <w:pPr>
+        <w:spacing w:after="120" w:line="360"/>
+        <w:ind w:firstLine="709"/>
+        <w:jc w:val="both"/>
+      </w:pPr>
+      <w:r>
+        <w:rPr>
+          <w:rFonts w:ascii="Arial" w:cs="Arial" w:eastAsia="Arial" w:hAnsi="Arial"/>
+          <w:sz w:val="24"/>
+          <w:szCs w:val="24"/>
+        </w:rPr>
+        <w:t xml:space="preserve">Se você já tem um emulador configurado com Android 8.0 ou superior, pule para a seção 4.4.</w:t>
+      </w:r>
+    </w:p>
+    <w:p>
+      <w:pPr>
+        <w:pStyle w:val="ListParagraph"/>
+        <w:numPr>
+          <w:ilvl w:val="0"/>
+          <w:numId w:val="5"/>
+        </w:numPr>
+        <w:spacing w:after="80" w:line="360"/>
+        <w:jc w:val="both"/>
+      </w:pPr>
+      <w:r>
+        <w:rPr>
+          <w:rFonts w:ascii="Arial" w:cs="Arial" w:eastAsia="Arial" w:hAnsi="Arial"/>
+          <w:sz w:val="24"/>
+          <w:szCs w:val="24"/>
+        </w:rPr>
+        <w:t xml:space="preserve">No menu superior, vá em Tools e clique em "Device Manager". Um painel abre na lateral direita.</w:t>
+      </w:r>
+    </w:p>
+    <w:p>
+      <w:pPr>
+        <w:pStyle w:val="ListParagraph"/>
+        <w:numPr>
+          <w:ilvl w:val="0"/>
+          <w:numId w:val="5"/>
+        </w:numPr>
+        <w:spacing w:after="80" w:line="360"/>
+        <w:jc w:val="both"/>
+      </w:pPr>
+      <w:r>
+        <w:rPr>
+          <w:rFonts w:ascii="Arial" w:cs="Arial" w:eastAsia="Arial" w:hAnsi="Arial"/>
+          <w:sz w:val="24"/>
+          <w:szCs w:val="24"/>
+        </w:rPr>
+        <w:t xml:space="preserve">Clique no botão "+" (ou "Create Device", dependendo da versão).</w:t>
+      </w:r>
+    </w:p>
+    <w:p>
+      <w:pPr>
+        <w:pStyle w:val="ListParagraph"/>
+        <w:numPr>
+          <w:ilvl w:val="0"/>
+          <w:numId w:val="5"/>
+        </w:numPr>
+        <w:spacing w:after="80" w:line="360"/>
+        <w:jc w:val="both"/>
+      </w:pPr>
+      <w:r>
+        <w:rPr>
+          <w:rFonts w:ascii="Arial" w:cs="Arial" w:eastAsia="Arial" w:hAnsi="Arial"/>
+          <w:sz w:val="24"/>
+          <w:szCs w:val="24"/>
+        </w:rPr>
+        <w:t xml:space="preserve">Na lista de aparelhos, escolha um Pixel na categoria Phone. O Pixel 7 ou o Pixel 6 servem bem. Clique em Next.</w:t>
+      </w:r>
+    </w:p>
+    <w:p>
+      <w:pPr>
+        <w:pStyle w:val="ListParagraph"/>
+        <w:numPr>
+          <w:ilvl w:val="0"/>
+          <w:numId w:val="5"/>
+        </w:numPr>
+        <w:spacing w:after="80" w:line="360"/>
+        <w:jc w:val="both"/>
+      </w:pPr>
+      <w:r>
+        <w:rPr>
+          <w:rFonts w:ascii="Arial" w:cs="Arial" w:eastAsia="Arial" w:hAnsi="Arial"/>
+          <w:sz w:val="24"/>
+          <w:szCs w:val="24"/>
+        </w:rPr>
+        <w:t xml:space="preserve">Na tela de imagem do sistema, escolha uma linha com API Level 34 ou 35. Se aparecer um ícone de download ao lado do nome, clique nele e espere baixar (cerca de 1,5 GB). Depois clique em Next.</w:t>
+      </w:r>
+    </w:p>
+    <w:p>
+      <w:pPr>
+        <w:pStyle w:val="ListParagraph"/>
+        <w:numPr>
+          <w:ilvl w:val="0"/>
+          <w:numId w:val="5"/>
+        </w:numPr>
+        <w:spacing w:after="80" w:line="360"/>
+        <w:jc w:val="both"/>
+      </w:pPr>
+      <w:r>
+        <w:rPr>
+          <w:rFonts w:ascii="Arial" w:cs="Arial" w:eastAsia="Arial" w:hAnsi="Arial"/>
+          <w:sz w:val="24"/>
+          <w:szCs w:val="24"/>
+        </w:rPr>
+        <w:t xml:space="preserve">Na última tela, deixe o nome padrão e clique em Finish.</w:t>
+      </w:r>
+    </w:p>
+    <w:tbl>
+      <w:tblPr>
+        <w:tblW w:type="dxa" w:w="9070"/>
+        <w:tblBorders>
+          <w:top w:val="single" w:color="000000" w:sz="4"/>
+          <w:left w:val="single" w:color="000000" w:sz="4"/>
+          <w:bottom w:val="single" w:color="000000" w:sz="4"/>
+          <w:right w:val="single" w:color="000000" w:sz="4"/>
+          <w:insideH w:val="single" w:color="000000" w:sz="4"/>
+          <w:insideV w:val="single" w:color="000000" w:sz="4"/>
+        </w:tblBorders>
+      </w:tblPr>
+      <w:tblGrid>
+        <w:gridCol w:w="9070"/>
+      </w:tblGrid>
+      <w:tr>
+        <w:tc>
+          <w:tcPr>
+            <w:tcW w:type="dxa" w:w="9070"/>
+            <w:tcMar>
+              <w:top w:type="dxa" w:w="120"/>
+              <w:left w:type="dxa" w:w="150"/>
+              <w:bottom w:type="dxa" w:w="120"/>
+              <w:right w:type="dxa" w:w="150"/>
+            </w:tcMar>
+          </w:tcPr>
+          <w:p>
+            <w:pPr>
+              <w:spacing w:after="60" w:line="240"/>
+            </w:pPr>
+            <w:r>
+              <w:rPr>
+                <w:rFonts w:ascii="Arial" w:cs="Arial" w:eastAsia="Arial" w:hAnsi="Arial"/>
+                <w:b/>
+                <w:bCs/>
+                <w:sz w:val="22"/>
+                <w:szCs w:val="22"/>
+              </w:rPr>
+              <w:t xml:space="preserve">Qual API escolher</w:t>
+            </w:r>
+          </w:p>
+          <w:p>
+            <w:pPr>
+              <w:spacing w:after="0" w:line="240"/>
+              <w:jc w:val="both"/>
+            </w:pPr>
+            <w:r>
+              <w:rPr>
+                <w:rFonts w:ascii="Arial" w:cs="Arial" w:eastAsia="Arial" w:hAnsi="Arial"/>
+                <w:sz w:val="22"/>
+                <w:szCs w:val="22"/>
+              </w:rPr>
+              <w:t xml:space="preserve">O aplicativo roda de API 26 até API 35. Recomendo API 33 ou superior porque é nelas que a permissão de notificação é pedida em tempo de execução, e isso faz parte do que o trabalho demonstra. Em API menor que 33 a notificação funciona, mas sem a tela de permissão.</w:t>
+            </w:r>
+          </w:p>
+        </w:tc>
+      </w:tr>
+    </w:tbl>
+    <w:p>
+      <w:pPr>
+        <w:pStyle w:val="Heading2"/>
+        <w:spacing w:after="200" w:before="360" w:line="360"/>
+        <w:jc w:val="left"/>
+      </w:pPr>
+      <w:r>
+        <w:rPr>
+          <w:rFonts w:ascii="Arial" w:cs="Arial" w:eastAsia="Arial" w:hAnsi="Arial"/>
+          <w:b/>
+          <w:bCs/>
+          <w:sz w:val="24"/>
+          <w:szCs w:val="24"/>
+        </w:rPr>
+        <w:t xml:space="preserve">4.4 Executar</w:t>
+      </w:r>
+    </w:p>
+    <w:p>
+      <w:pPr>
+        <w:pStyle w:val="ListParagraph"/>
+        <w:numPr>
+          <w:ilvl w:val="0"/>
+          <w:numId w:val="6"/>
+        </w:numPr>
+        <w:spacing w:after="80" w:line="360"/>
+        <w:jc w:val="both"/>
+      </w:pPr>
+      <w:r>
+        <w:rPr>
+          <w:rFonts w:ascii="Arial" w:cs="Arial" w:eastAsia="Arial" w:hAnsi="Arial"/>
+          <w:sz w:val="24"/>
+          <w:szCs w:val="24"/>
+        </w:rPr>
+        <w:t xml:space="preserve">Na barra superior do Android Studio, ao lado do botão verde de play, há uma caixa de seleção de dispositivo. Clique nela e escolha o emulador que você criou.</w:t>
+      </w:r>
+    </w:p>
+    <w:p>
+      <w:pPr>
+        <w:pStyle w:val="ListParagraph"/>
+        <w:numPr>
+          <w:ilvl w:val="0"/>
+          <w:numId w:val="6"/>
+        </w:numPr>
+        <w:spacing w:after="80" w:line="360"/>
+        <w:jc w:val="both"/>
+      </w:pPr>
+      <w:r>
+        <w:rPr>
+          <w:rFonts w:ascii="Arial" w:cs="Arial" w:eastAsia="Arial" w:hAnsi="Arial"/>
+          <w:sz w:val="24"/>
+          <w:szCs w:val="24"/>
+        </w:rPr>
+        <w:t xml:space="preserve">Confirme que ao lado, na outra caixa, está selecionado "app".</w:t>
+      </w:r>
+    </w:p>
+    <w:p>
+      <w:pPr>
+        <w:pStyle w:val="ListParagraph"/>
+        <w:numPr>
+          <w:ilvl w:val="0"/>
+          <w:numId w:val="6"/>
         </w:numPr>
         <w:spacing w:after="80" w:line="360"/>
         <w:jc w:val="both"/>
@@ -1521,7 +2718,7 @@
           <w:sz w:val="20"/>
           <w:szCs w:val="20"/>
         </w:rPr>
-        <w:t xml:space="preserve">Tabela 1 - Usuários cadastrados para teste</w:t>
+        <w:t xml:space="preserve">Tabela 3 - Usuários cadastrados para teste</w:t>
       </w:r>
     </w:p>
     <w:tbl>
@@ -2082,7 +3279,7 @@
         <w:pStyle w:val="ListParagraph"/>
         <w:numPr>
           <w:ilvl w:val="0"/>
-          <w:numId w:val="2"/>
+          <w:numId w:val="7"/>
         </w:numPr>
         <w:spacing w:after="80" w:line="360"/>
         <w:jc w:val="both"/>
@@ -2101,7 +3298,7 @@
         <w:pStyle w:val="ListParagraph"/>
         <w:numPr>
           <w:ilvl w:val="0"/>
-          <w:numId w:val="2"/>
+          <w:numId w:val="7"/>
         </w:numPr>
         <w:spacing w:after="80" w:line="360"/>
         <w:jc w:val="both"/>
@@ -2120,7 +3317,7 @@
         <w:pStyle w:val="ListParagraph"/>
         <w:numPr>
           <w:ilvl w:val="0"/>
-          <w:numId w:val="2"/>
+          <w:numId w:val="7"/>
         </w:numPr>
         <w:spacing w:after="80" w:line="360"/>
         <w:jc w:val="both"/>
@@ -2139,7 +3336,7 @@
         <w:pStyle w:val="ListParagraph"/>
         <w:numPr>
           <w:ilvl w:val="0"/>
-          <w:numId w:val="2"/>
+          <w:numId w:val="7"/>
         </w:numPr>
         <w:spacing w:after="80" w:line="360"/>
         <w:jc w:val="both"/>
@@ -2158,7 +3355,7 @@
         <w:pStyle w:val="ListParagraph"/>
         <w:numPr>
           <w:ilvl w:val="0"/>
-          <w:numId w:val="2"/>
+          <w:numId w:val="7"/>
         </w:numPr>
         <w:spacing w:after="80" w:line="360"/>
         <w:jc w:val="both"/>
@@ -2177,7 +3374,7 @@
         <w:pStyle w:val="ListParagraph"/>
         <w:numPr>
           <w:ilvl w:val="0"/>
-          <w:numId w:val="2"/>
+          <w:numId w:val="7"/>
         </w:numPr>
         <w:spacing w:after="80" w:line="360"/>
         <w:jc w:val="both"/>
@@ -2196,7 +3393,7 @@
         <w:pStyle w:val="ListParagraph"/>
         <w:numPr>
           <w:ilvl w:val="0"/>
-          <w:numId w:val="2"/>
+          <w:numId w:val="7"/>
         </w:numPr>
         <w:spacing w:after="80" w:line="360"/>
         <w:jc w:val="both"/>
@@ -2215,7 +3412,7 @@
         <w:pStyle w:val="ListParagraph"/>
         <w:numPr>
           <w:ilvl w:val="0"/>
-          <w:numId w:val="2"/>
+          <w:numId w:val="7"/>
         </w:numPr>
         <w:spacing w:after="80" w:line="360"/>
         <w:jc w:val="both"/>
@@ -2234,7 +3431,7 @@
         <w:pStyle w:val="ListParagraph"/>
         <w:numPr>
           <w:ilvl w:val="0"/>
-          <w:numId w:val="2"/>
+          <w:numId w:val="7"/>
         </w:numPr>
         <w:spacing w:after="80" w:line="360"/>
         <w:jc w:val="both"/>
@@ -2253,7 +3450,7 @@
         <w:pStyle w:val="ListParagraph"/>
         <w:numPr>
           <w:ilvl w:val="0"/>
-          <w:numId w:val="2"/>
+          <w:numId w:val="7"/>
         </w:numPr>
         <w:spacing w:after="80" w:line="360"/>
         <w:jc w:val="both"/>
@@ -2272,7 +3469,7 @@
         <w:pStyle w:val="ListParagraph"/>
         <w:numPr>
           <w:ilvl w:val="0"/>
-          <w:numId w:val="2"/>
+          <w:numId w:val="7"/>
         </w:numPr>
         <w:spacing w:after="80" w:line="360"/>
         <w:jc w:val="both"/>
@@ -2323,7 +3520,7 @@
         <w:pStyle w:val="ListParagraph"/>
         <w:numPr>
           <w:ilvl w:val="0"/>
-          <w:numId w:val="2"/>
+          <w:numId w:val="8"/>
         </w:numPr>
         <w:spacing w:after="80" w:line="360"/>
         <w:jc w:val="both"/>
@@ -2342,7 +3539,7 @@
         <w:pStyle w:val="ListParagraph"/>
         <w:numPr>
           <w:ilvl w:val="0"/>
-          <w:numId w:val="2"/>
+          <w:numId w:val="8"/>
         </w:numPr>
         <w:spacing w:after="80" w:line="360"/>
         <w:jc w:val="both"/>
@@ -2361,7 +3558,7 @@
         <w:pStyle w:val="ListParagraph"/>
         <w:numPr>
           <w:ilvl w:val="0"/>
-          <w:numId w:val="2"/>
+          <w:numId w:val="8"/>
         </w:numPr>
         <w:spacing w:after="80" w:line="360"/>
         <w:jc w:val="both"/>
@@ -2380,7 +3577,7 @@
         <w:pStyle w:val="ListParagraph"/>
         <w:numPr>
           <w:ilvl w:val="0"/>
-          <w:numId w:val="2"/>
+          <w:numId w:val="8"/>
         </w:numPr>
         <w:spacing w:after="80" w:line="360"/>
         <w:jc w:val="both"/>
@@ -2399,7 +3596,7 @@
         <w:pStyle w:val="ListParagraph"/>
         <w:numPr>
           <w:ilvl w:val="0"/>
-          <w:numId w:val="2"/>
+          <w:numId w:val="8"/>
         </w:numPr>
         <w:spacing w:after="80" w:line="360"/>
         <w:jc w:val="both"/>
@@ -2513,7 +3710,7 @@
         <w:pStyle w:val="ListParagraph"/>
         <w:numPr>
           <w:ilvl w:val="0"/>
-          <w:numId w:val="2"/>
+          <w:numId w:val="9"/>
         </w:numPr>
         <w:spacing w:after="80" w:line="360"/>
         <w:jc w:val="both"/>
@@ -2532,7 +3729,7 @@
         <w:pStyle w:val="ListParagraph"/>
         <w:numPr>
           <w:ilvl w:val="0"/>
-          <w:numId w:val="2"/>
+          <w:numId w:val="9"/>
         </w:numPr>
         <w:spacing w:after="80" w:line="360"/>
         <w:jc w:val="both"/>
@@ -2551,7 +3748,7 @@
         <w:pStyle w:val="ListParagraph"/>
         <w:numPr>
           <w:ilvl w:val="0"/>
-          <w:numId w:val="2"/>
+          <w:numId w:val="9"/>
         </w:numPr>
         <w:spacing w:after="80" w:line="360"/>
         <w:jc w:val="both"/>
@@ -2570,7 +3767,7 @@
         <w:pStyle w:val="ListParagraph"/>
         <w:numPr>
           <w:ilvl w:val="0"/>
-          <w:numId w:val="2"/>
+          <w:numId w:val="9"/>
         </w:numPr>
         <w:spacing w:after="80" w:line="360"/>
         <w:jc w:val="both"/>
@@ -2589,7 +3786,7 @@
         <w:pStyle w:val="ListParagraph"/>
         <w:numPr>
           <w:ilvl w:val="0"/>
-          <w:numId w:val="2"/>
+          <w:numId w:val="9"/>
         </w:numPr>
         <w:spacing w:after="80" w:line="360"/>
         <w:jc w:val="both"/>
@@ -2608,7 +3805,7 @@
         <w:pStyle w:val="ListParagraph"/>
         <w:numPr>
           <w:ilvl w:val="0"/>
-          <w:numId w:val="2"/>
+          <w:numId w:val="9"/>
         </w:numPr>
         <w:spacing w:after="80" w:line="360"/>
         <w:jc w:val="both"/>
@@ -2627,7 +3824,7 @@
         <w:pStyle w:val="ListParagraph"/>
         <w:numPr>
           <w:ilvl w:val="0"/>
-          <w:numId w:val="2"/>
+          <w:numId w:val="9"/>
         </w:numPr>
         <w:spacing w:after="80" w:line="360"/>
         <w:jc w:val="both"/>
@@ -2736,7 +3933,7 @@
         <w:pStyle w:val="ListParagraph"/>
         <w:numPr>
           <w:ilvl w:val="0"/>
-          <w:numId w:val="2"/>
+          <w:numId w:val="10"/>
         </w:numPr>
         <w:spacing w:after="80" w:line="360"/>
         <w:jc w:val="both"/>
@@ -2755,7 +3952,7 @@
         <w:pStyle w:val="ListParagraph"/>
         <w:numPr>
           <w:ilvl w:val="0"/>
-          <w:numId w:val="2"/>
+          <w:numId w:val="10"/>
         </w:numPr>
         <w:spacing w:after="80" w:line="360"/>
         <w:jc w:val="both"/>
@@ -2774,7 +3971,7 @@
         <w:pStyle w:val="ListParagraph"/>
         <w:numPr>
           <w:ilvl w:val="0"/>
-          <w:numId w:val="2"/>
+          <w:numId w:val="10"/>
         </w:numPr>
         <w:spacing w:after="80" w:line="360"/>
         <w:jc w:val="both"/>
@@ -2793,7 +3990,7 @@
         <w:pStyle w:val="ListParagraph"/>
         <w:numPr>
           <w:ilvl w:val="0"/>
-          <w:numId w:val="2"/>
+          <w:numId w:val="10"/>
         </w:numPr>
         <w:spacing w:after="80" w:line="360"/>
         <w:jc w:val="both"/>
@@ -2812,7 +4009,7 @@
         <w:pStyle w:val="ListParagraph"/>
         <w:numPr>
           <w:ilvl w:val="0"/>
-          <w:numId w:val="2"/>
+          <w:numId w:val="10"/>
         </w:numPr>
         <w:spacing w:after="80" w:line="360"/>
         <w:jc w:val="both"/>
@@ -2920,7 +4117,7 @@
           <w:sz w:val="20"/>
           <w:szCs w:val="20"/>
         </w:rPr>
-        <w:t xml:space="preserve">Tabela 2 - Erros mais frequentes e como resolver</w:t>
+        <w:t xml:space="preserve">Tabela 4 - Erros mais frequentes e como resolver</w:t>
       </w:r>
     </w:p>
     <w:tbl>
@@ -4196,6 +5393,54 @@
     </w:lvlOverride>
   </w:num>
   <w:num w:numId="2">
+    <w:abstractNumId w:val="3"/>
+    <w:lvlOverride w:ilvl="0">
+      <w:startOverride w:val="1"/>
+    </w:lvlOverride>
+  </w:num>
+  <w:num w:numId="3">
+    <w:abstractNumId w:val="3"/>
+    <w:lvlOverride w:ilvl="0">
+      <w:startOverride w:val="1"/>
+    </w:lvlOverride>
+  </w:num>
+  <w:num w:numId="4">
+    <w:abstractNumId w:val="3"/>
+    <w:lvlOverride w:ilvl="0">
+      <w:startOverride w:val="1"/>
+    </w:lvlOverride>
+  </w:num>
+  <w:num w:numId="5">
+    <w:abstractNumId w:val="3"/>
+    <w:lvlOverride w:ilvl="0">
+      <w:startOverride w:val="1"/>
+    </w:lvlOverride>
+  </w:num>
+  <w:num w:numId="6">
+    <w:abstractNumId w:val="3"/>
+    <w:lvlOverride w:ilvl="0">
+      <w:startOverride w:val="1"/>
+    </w:lvlOverride>
+  </w:num>
+  <w:num w:numId="7">
+    <w:abstractNumId w:val="3"/>
+    <w:lvlOverride w:ilvl="0">
+      <w:startOverride w:val="1"/>
+    </w:lvlOverride>
+  </w:num>
+  <w:num w:numId="8">
+    <w:abstractNumId w:val="3"/>
+    <w:lvlOverride w:ilvl="0">
+      <w:startOverride w:val="1"/>
+    </w:lvlOverride>
+  </w:num>
+  <w:num w:numId="9">
+    <w:abstractNumId w:val="3"/>
+    <w:lvlOverride w:ilvl="0">
+      <w:startOverride w:val="1"/>
+    </w:lvlOverride>
+  </w:num>
+  <w:num w:numId="10">
     <w:abstractNumId w:val="3"/>
     <w:lvlOverride w:ilvl="0">
       <w:startOverride w:val="1"/>

</xml_diff>

<commit_message>
Script de criação do banco do zero
jcondo.sql agora recria o banco (DROP + CREATE), insere os dados de exemplo
com datas relativas à importação e traz uma consulta de conferência no fim.
A reserva e a ocorrência de exemplo entram pelo script, com os ids vindo de
subconsulta em vez de número fixo.
</commit_message>
<xml_diff>
--- a/docs/Guia_de_Execucao.docx
+++ b/docs/Guia_de_Execucao.docx
@@ -1258,7 +1258,7 @@
                 <w:sz w:val="20"/>
                 <w:szCs w:val="20"/>
               </w:rPr>
-              <w:t xml:space="preserve">Nunca criei o banco jcondo neste computador.</w:t>
+              <w:t xml:space="preserve">Quero o banco do zero, seja porque ele não existe ainda, seja porque não me importo em perder o que está lá.</w:t>
             </w:r>
           </w:p>
         </w:tc>
@@ -1283,7 +1283,7 @@
                 <w:sz w:val="20"/>
                 <w:szCs w:val="20"/>
               </w:rPr>
-              <w:t xml:space="preserve">No phpMyAdmin, aba "Importar", escolha o arquivo backend/database/jcondo.sql e clique em Executar. Ele cria o banco, as cinco tabelas e os dados de exemplo.</w:t>
+              <w:t xml:space="preserve">No phpMyAdmin, aba "Importar", escolha backend/database/jcondo.sql e clique em Executar. O script apaga o banco jcondo se existir, recria do zero e insere os dados de exemplo.</w:t>
             </w:r>
           </w:p>
         </w:tc>
@@ -1310,7 +1310,7 @@
                 <w:sz w:val="20"/>
                 <w:szCs w:val="20"/>
               </w:rPr>
-              <w:t xml:space="preserve">Já tenho o banco jcondo, do projeto web, e quero manter os moradores cadastrados.</w:t>
+              <w:t xml:space="preserve">Já tenho o banco jcondo, do projeto web, e preciso manter os moradores cadastrados.</w:t>
             </w:r>
           </w:p>
         </w:tc>
@@ -1335,59 +1335,7 @@
                 <w:sz w:val="20"/>
                 <w:szCs w:val="20"/>
               </w:rPr>
-              <w:t xml:space="preserve">Use backend/database/migracao_projeto_web.sql. Ele explica o que a aplicação faz sozinha e traz o único comando que precisa ser rodado na mão.</w:t>
-            </w:r>
-          </w:p>
-        </w:tc>
-      </w:tr>
-      <w:tr>
-        <w:tc>
-          <w:tcPr>
-            <w:tcW w:type="dxa" w:w="3200"/>
-            <w:tcMar>
-              <w:top w:type="dxa" w:w="70"/>
-              <w:left w:type="dxa" w:w="100"/>
-              <w:bottom w:type="dxa" w:w="70"/>
-              <w:right w:type="dxa" w:w="100"/>
-            </w:tcMar>
-          </w:tcPr>
-          <w:p>
-            <w:pPr>
-              <w:spacing w:after="0" w:line="240"/>
-              <w:jc w:val="left"/>
-            </w:pPr>
-            <w:r>
-              <w:rPr>
-                <w:rFonts w:ascii="Arial" w:cs="Arial" w:eastAsia="Arial" w:hAnsi="Arial"/>
-                <w:sz w:val="20"/>
-                <w:szCs w:val="20"/>
-              </w:rPr>
-              <w:t xml:space="preserve">Já tenho o banco jcondo mas não me importo em perder o conteúdo.</w:t>
-            </w:r>
-          </w:p>
-        </w:tc>
-        <w:tc>
-          <w:tcPr>
-            <w:tcW w:type="dxa" w:w="5870"/>
-            <w:tcMar>
-              <w:top w:type="dxa" w:w="70"/>
-              <w:left w:type="dxa" w:w="100"/>
-              <w:bottom w:type="dxa" w:w="70"/>
-              <w:right w:type="dxa" w:w="100"/>
-            </w:tcMar>
-          </w:tcPr>
-          <w:p>
-            <w:pPr>
-              <w:spacing w:after="0" w:line="240"/>
-              <w:jc w:val="left"/>
-            </w:pPr>
-            <w:r>
-              <w:rPr>
-                <w:rFonts w:ascii="Arial" w:cs="Arial" w:eastAsia="Arial" w:hAnsi="Arial"/>
-                <w:sz w:val="20"/>
-                <w:szCs w:val="20"/>
-              </w:rPr>
-              <w:t xml:space="preserve">No phpMyAdmin, selecione o banco jcondo, vá em "Operações" e clique em "Apagar o banco de dados (DROP)". Depois importe o jcondo.sql normalmente.</w:t>
+              <w:t xml:space="preserve">Use backend/database/migracao_projeto_web.sql. Ele preserva o que está lá e explica o que a aplicação faz sozinha na primeira execução.</w:t>
             </w:r>
           </w:p>
         </w:tc>
@@ -1405,6 +1353,169 @@
           <w:szCs w:val="20"/>
         </w:rPr>
         <w:t xml:space="preserve">Fonte: o autor (2026).</w:t>
+      </w:r>
+    </w:p>
+    <w:tbl>
+      <w:tblPr>
+        <w:tblW w:type="dxa" w:w="9070"/>
+        <w:tblBorders>
+          <w:top w:val="single" w:color="000000" w:sz="4"/>
+          <w:left w:val="single" w:color="000000" w:sz="4"/>
+          <w:bottom w:val="single" w:color="000000" w:sz="4"/>
+          <w:right w:val="single" w:color="000000" w:sz="4"/>
+          <w:insideH w:val="single" w:color="000000" w:sz="4"/>
+          <w:insideV w:val="single" w:color="000000" w:sz="4"/>
+        </w:tblBorders>
+      </w:tblPr>
+      <w:tblGrid>
+        <w:gridCol w:w="9070"/>
+      </w:tblGrid>
+      <w:tr>
+        <w:tc>
+          <w:tcPr>
+            <w:tcW w:type="dxa" w:w="9070"/>
+            <w:tcMar>
+              <w:top w:type="dxa" w:w="120"/>
+              <w:left w:type="dxa" w:w="150"/>
+              <w:bottom w:type="dxa" w:w="120"/>
+              <w:right w:type="dxa" w:w="150"/>
+            </w:tcMar>
+          </w:tcPr>
+          <w:p>
+            <w:pPr>
+              <w:spacing w:after="60" w:line="240"/>
+            </w:pPr>
+            <w:r>
+              <w:rPr>
+                <w:rFonts w:ascii="Arial" w:cs="Arial" w:eastAsia="Arial" w:hAnsi="Arial"/>
+                <w:b/>
+                <w:bCs/>
+                <w:sz w:val="22"/>
+                <w:szCs w:val="22"/>
+              </w:rPr>
+              <w:t xml:space="preserve">O jcondo.sql apaga o banco antes de criar</w:t>
+            </w:r>
+          </w:p>
+          <w:p>
+            <w:pPr>
+              <w:spacing w:after="0" w:line="240"/>
+              <w:jc w:val="both"/>
+            </w:pPr>
+            <w:r>
+              <w:rPr>
+                <w:rFonts w:ascii="Arial" w:cs="Arial" w:eastAsia="Arial" w:hAnsi="Arial"/>
+                <w:sz w:val="22"/>
+                <w:szCs w:val="22"/>
+              </w:rPr>
+              <w:t xml:space="preserve">A primeira linha dele é DROP DATABASE IF EXISTS jcondo. Isso é proposital: um script de criação do zero precisa poder ser executado mais de uma vez sem acumular erro de "tabela já existe". Se você tem alguma coisa no banco que não quer perder, comente essa linha antes de importar, ou use o arquivo de migração.</w:t>
+            </w:r>
+          </w:p>
+        </w:tc>
+      </w:tr>
+    </w:tbl>
+    <w:p>
+      <w:pPr>
+        <w:spacing w:after="120" w:line="360"/>
+        <w:ind w:firstLine="709"/>
+        <w:jc w:val="both"/>
+      </w:pPr>
+      <w:r>
+        <w:rPr>
+          <w:rFonts w:ascii="Arial" w:cs="Arial" w:eastAsia="Arial" w:hAnsi="Arial"/>
+          <w:sz w:val="24"/>
+          <w:szCs w:val="24"/>
+        </w:rPr>
+        <w:t xml:space="preserve">O que o jcondo.sql cria:</w:t>
+      </w:r>
+    </w:p>
+    <w:p>
+      <w:pPr>
+        <w:shd w:fill="F2F2F2" w:val="clear"/>
+        <w:spacing w:after="0" w:before="120" w:line="240"/>
+        <w:ind w:left="283"/>
+      </w:pPr>
+      <w:r>
+        <w:rPr>
+          <w:rFonts w:ascii="Courier New" w:cs="Courier New" w:eastAsia="Courier New" w:hAnsi="Courier New"/>
+          <w:sz w:val="19"/>
+          <w:szCs w:val="19"/>
+        </w:rPr>
+        <w:t xml:space="preserve">moradores      5 registros   4 moradores + 1 síndico</w:t>
+      </w:r>
+    </w:p>
+    <w:p>
+      <w:pPr>
+        <w:shd w:fill="F2F2F2" w:val="clear"/>
+        <w:spacing w:after="0" w:before="0" w:line="240"/>
+        <w:ind w:left="283"/>
+      </w:pPr>
+      <w:r>
+        <w:rPr>
+          <w:rFonts w:ascii="Courier New" w:cs="Courier New" w:eastAsia="Courier New" w:hAnsi="Courier New"/>
+          <w:sz w:val="19"/>
+          <w:szCs w:val="19"/>
+        </w:rPr>
+        <w:t xml:space="preserve">areas_comuns   5 registros   salão, churrasqueira, quadra, gourmet, reuniões</w:t>
+      </w:r>
+    </w:p>
+    <w:p>
+      <w:pPr>
+        <w:shd w:fill="F2F2F2" w:val="clear"/>
+        <w:spacing w:after="0" w:before="0" w:line="240"/>
+        <w:ind w:left="283"/>
+      </w:pPr>
+      <w:r>
+        <w:rPr>
+          <w:rFonts w:ascii="Courier New" w:cs="Courier New" w:eastAsia="Courier New" w:hAnsi="Courier New"/>
+          <w:sz w:val="19"/>
+          <w:szCs w:val="19"/>
+        </w:rPr>
+        <w:t xml:space="preserve">avisos         5 registros   com datas relativas ao dia da importação</w:t>
+      </w:r>
+    </w:p>
+    <w:p>
+      <w:pPr>
+        <w:shd w:fill="F2F2F2" w:val="clear"/>
+        <w:spacing w:after="0" w:before="0" w:line="240"/>
+        <w:ind w:left="283"/>
+      </w:pPr>
+      <w:r>
+        <w:rPr>
+          <w:rFonts w:ascii="Courier New" w:cs="Courier New" w:eastAsia="Courier New" w:hAnsi="Courier New"/>
+          <w:sz w:val="19"/>
+          <w:szCs w:val="19"/>
+        </w:rPr>
+        <w:t xml:space="preserve">reservas       1 registro    da Ana, seis dias à frente</w:t>
+      </w:r>
+    </w:p>
+    <w:p>
+      <w:pPr>
+        <w:shd w:fill="F2F2F2" w:val="clear"/>
+        <w:spacing w:after="200" w:before="0" w:line="240"/>
+        <w:ind w:left="283"/>
+      </w:pPr>
+      <w:r>
+        <w:rPr>
+          <w:rFonts w:ascii="Courier New" w:cs="Courier New" w:eastAsia="Courier New" w:hAnsi="Courier New"/>
+          <w:sz w:val="19"/>
+          <w:szCs w:val="19"/>
+        </w:rPr>
+        <w:t xml:space="preserve">ocorrencias    1 registro    da Ana, com resposta da administração</w:t>
+      </w:r>
+    </w:p>
+    <w:p>
+      <w:pPr>
+        <w:spacing w:after="120" w:line="360"/>
+        <w:ind w:firstLine="709"/>
+        <w:jc w:val="both"/>
+      </w:pPr>
+      <w:r>
+        <w:rPr>
+          <w:rFonts w:ascii="Arial" w:cs="Arial" w:eastAsia="Arial" w:hAnsi="Arial"/>
+          <w:sz w:val="24"/>
+          <w:szCs w:val="24"/>
+        </w:rPr>
+        <w:t xml:space="preserve">No fim do arquivo há uma consulta de conferência que devolve a contagem de cada tabela. Se os números baterem com os acima, a importação deu certo.</w:t>
       </w:r>
     </w:p>
     <w:tbl>

</xml_diff>